<commit_message>
deliver(cg): refresh complete 1008 submission package
</commit_message>
<xml_diff>
--- a/1008/submission_1008/Research_Highlights_1008_DRAFT.docx
+++ b/1008/submission_1008/Research_Highlights_1008_DRAFT.docx
@@ -20,7 +20,7 @@
         <w:pStyle w:val="Compact"/>
       </w:pPr>
       <w:r>
-        <w:t xml:space="preserve">TCAS applies a low–high–low scale profile to an existing geometry adapter.</w:t>
+        <w:t xml:space="preserve">TCAS applies a three-stage requested-scale profile to an existing geometry adapter.</w:t>
       </w:r>
     </w:p>
     <w:p>
@@ -32,7 +32,7 @@
         <w:pStyle w:val="Compact"/>
       </w:pPr>
       <w:r>
-        <w:t xml:space="preserve">Fresh C compares matched outputs on 300 objects under one frozen checkpoint.</w:t>
+        <w:t xml:space="preserve">Fresh C compares matched rendered outputs for 300 held-out objects.</w:t>
       </w:r>
     </w:p>
     <w:p>
@@ -56,7 +56,7 @@
         <w:pStyle w:val="Compact"/>
       </w:pPr>
       <w:r>
-        <w:t xml:space="preserve">GFH and Generic Linear provide counter-results to a universal C3 claim.</w:t>
+        <w:t xml:space="preserve">C3 and GFL differ in applied deep/middle scale sums; the result is not timing-only.</w:t>
       </w:r>
     </w:p>
     <w:p>
@@ -68,7 +68,7 @@
         <w:pStyle w:val="Compact"/>
       </w:pPr>
       <w:r>
-        <w:t xml:space="preserve">Image-space results do not establish 3D material quality or human preference.</w:t>
+        <w:t xml:space="preserve">Image-space results do not establish baked-texture, seam, or PBR quality.</w:t>
       </w:r>
     </w:p>
     <w:bookmarkEnd w:id="20"/>

</xml_diff>